<commit_message>
Improve thesis DOCX formatting for tables, captions, and bibliography.
Use landscape pages for wide tables, single-spaced compact cells, centered table captions, hanging-indent references, and cleaner evidence subsection styles.

Co-authored-by: Cursor <cursoragent@cursor.com>
</commit_message>
<xml_diff>
--- a/thesis_package/output/chapters/CHAPTER_1.docx
+++ b/thesis_package/output/chapters/CHAPTER_1.docx
@@ -830,6 +830,10 @@
       </w:r>
     </w:p>
     <w:p>
+      <w:pPr>
+        <w:pStyle w:val="Bibliography"/>
+        <w:ind w:left="720" w:hanging="720"/>
+      </w:pPr>
       <w:r>
         <w:rPr>
           <w:b w:val="0"/>
@@ -856,6 +860,10 @@
       </w:r>
     </w:p>
     <w:p>
+      <w:pPr>
+        <w:pStyle w:val="Bibliography"/>
+        <w:ind w:left="720" w:hanging="720"/>
+      </w:pPr>
       <w:r>
         <w:rPr>
           <w:b w:val="0"/>
@@ -882,6 +890,10 @@
       </w:r>
     </w:p>
     <w:p>
+      <w:pPr>
+        <w:pStyle w:val="Bibliography"/>
+        <w:ind w:left="720" w:hanging="720"/>
+      </w:pPr>
       <w:r>
         <w:rPr>
           <w:b w:val="0"/>
@@ -908,6 +920,10 @@
       </w:r>
     </w:p>
     <w:p>
+      <w:pPr>
+        <w:pStyle w:val="Bibliography"/>
+        <w:ind w:left="720" w:hanging="720"/>
+      </w:pPr>
       <w:r>
         <w:rPr>
           <w:b w:val="0"/>
@@ -934,6 +950,10 @@
       </w:r>
     </w:p>
     <w:p>
+      <w:pPr>
+        <w:pStyle w:val="Bibliography"/>
+        <w:ind w:left="720" w:hanging="720"/>
+      </w:pPr>
       <w:r>
         <w:rPr>
           <w:b w:val="0"/>
@@ -960,6 +980,10 @@
       </w:r>
     </w:p>
     <w:p>
+      <w:pPr>
+        <w:pStyle w:val="Bibliography"/>
+        <w:ind w:left="720" w:hanging="720"/>
+      </w:pPr>
       <w:r>
         <w:rPr>
           <w:b w:val="0"/>
@@ -986,6 +1010,10 @@
       </w:r>
     </w:p>
     <w:p>
+      <w:pPr>
+        <w:pStyle w:val="Bibliography"/>
+        <w:ind w:left="720" w:hanging="720"/>
+      </w:pPr>
       <w:r>
         <w:rPr>
           <w:b w:val="0"/>
@@ -1012,6 +1040,10 @@
       </w:r>
     </w:p>
     <w:p>
+      <w:pPr>
+        <w:pStyle w:val="Bibliography"/>
+        <w:ind w:left="720" w:hanging="720"/>
+      </w:pPr>
       <w:r>
         <w:rPr>
           <w:b w:val="0"/>
@@ -1038,6 +1070,10 @@
       </w:r>
     </w:p>
     <w:p>
+      <w:pPr>
+        <w:pStyle w:val="Bibliography"/>
+        <w:ind w:left="720" w:hanging="720"/>
+      </w:pPr>
       <w:r>
         <w:rPr>
           <w:b w:val="0"/>
@@ -1064,6 +1100,10 @@
       </w:r>
     </w:p>
     <w:p>
+      <w:pPr>
+        <w:pStyle w:val="Bibliography"/>
+        <w:ind w:left="720" w:hanging="720"/>
+      </w:pPr>
       <w:r>
         <w:rPr>
           <w:b w:val="0"/>
@@ -1090,6 +1130,10 @@
       </w:r>
     </w:p>
     <w:p>
+      <w:pPr>
+        <w:pStyle w:val="Bibliography"/>
+        <w:ind w:left="720" w:hanging="720"/>
+      </w:pPr>
       <w:r>
         <w:rPr>
           <w:b w:val="0"/>
@@ -1116,6 +1160,10 @@
       </w:r>
     </w:p>
     <w:p>
+      <w:pPr>
+        <w:pStyle w:val="Bibliography"/>
+        <w:ind w:left="720" w:hanging="720"/>
+      </w:pPr>
       <w:r>
         <w:rPr>
           <w:b w:val="0"/>
@@ -1142,6 +1190,10 @@
       </w:r>
     </w:p>
     <w:p>
+      <w:pPr>
+        <w:pStyle w:val="Bibliography"/>
+        <w:ind w:left="720" w:hanging="720"/>
+      </w:pPr>
       <w:r>
         <w:rPr>
           <w:b w:val="0"/>
@@ -1168,6 +1220,10 @@
       </w:r>
     </w:p>
     <w:p>
+      <w:pPr>
+        <w:pStyle w:val="Bibliography"/>
+        <w:ind w:left="720" w:hanging="720"/>
+      </w:pPr>
       <w:r>
         <w:rPr>
           <w:b w:val="0"/>
@@ -1194,6 +1250,10 @@
       </w:r>
     </w:p>
     <w:p>
+      <w:pPr>
+        <w:pStyle w:val="Bibliography"/>
+        <w:ind w:left="720" w:hanging="720"/>
+      </w:pPr>
       <w:r>
         <w:rPr>
           <w:b w:val="0"/>
@@ -1220,6 +1280,10 @@
       </w:r>
     </w:p>
     <w:p>
+      <w:pPr>
+        <w:pStyle w:val="Bibliography"/>
+        <w:ind w:left="720" w:hanging="720"/>
+      </w:pPr>
       <w:r>
         <w:rPr>
           <w:b w:val="0"/>
@@ -1246,6 +1310,10 @@
       </w:r>
     </w:p>
     <w:p>
+      <w:pPr>
+        <w:pStyle w:val="Bibliography"/>
+        <w:ind w:left="720" w:hanging="720"/>
+      </w:pPr>
       <w:r>
         <w:rPr>
           <w:b w:val="0"/>
@@ -1272,6 +1340,10 @@
       </w:r>
     </w:p>
     <w:p>
+      <w:pPr>
+        <w:pStyle w:val="Bibliography"/>
+        <w:ind w:left="720" w:hanging="720"/>
+      </w:pPr>
       <w:r>
         <w:rPr>
           <w:b w:val="0"/>
@@ -1298,6 +1370,10 @@
       </w:r>
     </w:p>
     <w:p>
+      <w:pPr>
+        <w:pStyle w:val="Bibliography"/>
+        <w:ind w:left="720" w:hanging="720"/>
+      </w:pPr>
       <w:r>
         <w:rPr>
           <w:b w:val="0"/>
@@ -1324,6 +1400,10 @@
       </w:r>
     </w:p>
     <w:p>
+      <w:pPr>
+        <w:pStyle w:val="Bibliography"/>
+        <w:ind w:left="720" w:hanging="720"/>
+      </w:pPr>
       <w:r>
         <w:rPr>
           <w:b w:val="0"/>
@@ -1350,6 +1430,10 @@
       </w:r>
     </w:p>
     <w:p>
+      <w:pPr>
+        <w:pStyle w:val="Bibliography"/>
+        <w:ind w:left="720" w:hanging="720"/>
+      </w:pPr>
       <w:r>
         <w:rPr>
           <w:b w:val="0"/>
@@ -1376,6 +1460,10 @@
       </w:r>
     </w:p>
     <w:p>
+      <w:pPr>
+        <w:pStyle w:val="Bibliography"/>
+        <w:ind w:left="720" w:hanging="720"/>
+      </w:pPr>
       <w:r>
         <w:rPr>
           <w:b w:val="0"/>
@@ -1402,6 +1490,10 @@
       </w:r>
     </w:p>
     <w:p>
+      <w:pPr>
+        <w:pStyle w:val="Bibliography"/>
+        <w:ind w:left="720" w:hanging="720"/>
+      </w:pPr>
       <w:r>
         <w:rPr>
           <w:b w:val="0"/>
@@ -1428,6 +1520,10 @@
       </w:r>
     </w:p>
     <w:p>
+      <w:pPr>
+        <w:pStyle w:val="Bibliography"/>
+        <w:ind w:left="720" w:hanging="720"/>
+      </w:pPr>
       <w:r>
         <w:rPr>
           <w:b w:val="0"/>
@@ -1454,6 +1550,10 @@
       </w:r>
     </w:p>
     <w:p>
+      <w:pPr>
+        <w:pStyle w:val="Bibliography"/>
+        <w:ind w:left="720" w:hanging="720"/>
+      </w:pPr>
       <w:r>
         <w:rPr>
           <w:b w:val="0"/>
@@ -2030,7 +2130,7 @@
       <w:rFonts w:asciiTheme="majorHAnsi" w:eastAsiaTheme="majorEastAsia" w:hAnsiTheme="majorHAnsi" w:cstheme="majorBidi" w:ascii="Times New Roman" w:hAnsi="Times New Roman"/>
       <w:b/>
       <w:bCs/>
-      <w:i/>
+      <w:i w:val="0"/>
       <w:color w:val="4F81BD" w:themeColor="accent1"/>
       <w:sz w:val="24"/>
     </w:rPr>
@@ -2048,16 +2148,18 @@
     <w:pPr>
       <w:keepNext/>
       <w:keepLines/>
-      <w:spacing w:before="200" w:after="0"/>
+      <w:spacing w:before="120" w:after="60" w:line="480" w:lineRule="auto"/>
+      <w:ind w:firstLine="0"/>
       <w:outlineLvl w:val="3"/>
     </w:pPr>
     <w:rPr>
-      <w:rFonts w:asciiTheme="majorHAnsi" w:eastAsiaTheme="majorEastAsia" w:hAnsiTheme="majorHAnsi" w:cstheme="majorBidi"/>
+      <w:rFonts w:asciiTheme="majorHAnsi" w:eastAsiaTheme="majorEastAsia" w:hAnsiTheme="majorHAnsi" w:cstheme="majorBidi" w:ascii="Times New Roman" w:hAnsi="Times New Roman"/>
       <w:b/>
       <w:bCs/>
-      <w:i/>
+      <w:i w:val="0"/>
       <w:iCs/>
       <w:color w:val="4F81BD" w:themeColor="accent1"/>
+      <w:sz w:val="24"/>
     </w:rPr>
   </w:style>
   <w:style w:type="paragraph" w:styleId="Heading5">
@@ -2448,8 +2550,14 @@
       <w:numPr>
         <w:numId w:val="1"/>
       </w:numPr>
+      <w:spacing w:line="480" w:lineRule="auto" w:after="0"/>
+      <w:ind w:left="720" w:firstLine="0"/>
       <w:contextualSpacing/>
     </w:pPr>
+    <w:rPr>
+      <w:rFonts w:ascii="Times New Roman" w:hAnsi="Times New Roman"/>
+      <w:sz w:val="24"/>
+    </w:rPr>
   </w:style>
   <w:style w:type="paragraph" w:styleId="ListBullet2">
     <w:name w:val="List Bullet 2"/>
@@ -2487,8 +2595,14 @@
       <w:numPr>
         <w:numId w:val="5"/>
       </w:numPr>
+      <w:spacing w:line="480" w:lineRule="auto" w:after="0"/>
+      <w:ind w:left="720" w:firstLine="0"/>
       <w:contextualSpacing/>
     </w:pPr>
+    <w:rPr>
+      <w:rFonts w:ascii="Times New Roman" w:hAnsi="Times New Roman"/>
+      <w:sz w:val="24"/>
+    </w:rPr>
   </w:style>
   <w:style w:type="paragraph" w:styleId="ListNumber2">
     <w:name w:val="List Number 2"/>
@@ -13624,6 +13738,31 @@
     </w:pPr>
     <w:rPr>
       <w:i/>
+    </w:rPr>
+  </w:style>
+  <w:style w:type="paragraph" w:customStyle="1" w:styleId="Bibliography">
+    <w:name w:val="Bibliography"/>
+    <w:basedOn w:val="Normal"/>
+    <w:pPr>
+      <w:spacing w:line="480" w:lineRule="auto" w:after="0"/>
+      <w:ind w:left="720" w:hanging="720"/>
+    </w:pPr>
+    <w:rPr>
+      <w:rFonts w:ascii="Times New Roman" w:hAnsi="Times New Roman"/>
+      <w:sz w:val="24"/>
+    </w:rPr>
+  </w:style>
+  <w:style w:type="paragraph" w:customStyle="1" w:styleId="TableNote">
+    <w:name w:val="Table Note"/>
+    <w:basedOn w:val="Normal"/>
+    <w:pPr>
+      <w:spacing w:before="60" w:after="180" w:line="240" w:lineRule="auto"/>
+      <w:ind w:firstLine="0"/>
+    </w:pPr>
+    <w:rPr>
+      <w:rFonts w:ascii="Times New Roman" w:hAnsi="Times New Roman"/>
+      <w:i/>
+      <w:sz w:val="20"/>
     </w:rPr>
   </w:style>
 </w:styles>

</xml_diff>